<commit_message>
Update: Surgical 2026 Stats and UI Duplicate Fix -
</commit_message>
<xml_diff>
--- a/Code Examples.docx
+++ b/Code Examples.docx
@@ -28,15 +28,96 @@
           <w:sz w:val="30"/>
           <w:szCs w:val="30"/>
         </w:rPr>
+        <w:t xml:space="preserve">python </w:t>
+      </w:r>
+      <w:r>
+        <w:rPr>
+          <w:sz w:val="30"/>
+          <w:szCs w:val="30"/>
+        </w:rPr>
+        <w:t>master</w:t>
+      </w:r>
+      <w:r>
+        <w:rPr>
+          <w:sz w:val="30"/>
+          <w:szCs w:val="30"/>
+        </w:rPr>
+        <w:t>_sync</w:t>
+      </w:r>
+      <w:r>
+        <w:rPr>
+          <w:sz w:val="30"/>
+          <w:szCs w:val="30"/>
+        </w:rPr>
+        <w:t>.py</w:t>
+      </w:r>
+      <w:r>
+        <w:rPr>
+          <w:sz w:val="30"/>
+          <w:szCs w:val="30"/>
+        </w:rPr>
+        <w:t>)</w:t>
+      </w:r>
+    </w:p>
+    <w:p>
+      <w:pPr>
+        <w:ind w:firstLine="720"/>
+        <w:rPr>
+          <w:sz w:val="30"/>
+          <w:szCs w:val="30"/>
+        </w:rPr>
+      </w:pPr>
+      <w:r>
+        <w:rPr>
+          <w:sz w:val="30"/>
+          <w:szCs w:val="30"/>
+        </w:rPr>
         <w:t>python master_sync.py</w:t>
       </w:r>
-      <w:r>
-        <w:rPr>
-          <w:sz w:val="30"/>
-          <w:szCs w:val="30"/>
-        </w:rPr>
-        <w:t>)</w:t>
-      </w:r>
+    </w:p>
+    <w:p>
+      <w:pPr>
+        <w:rPr>
+          <w:sz w:val="30"/>
+          <w:szCs w:val="30"/>
+        </w:rPr>
+      </w:pPr>
+      <w:r>
+        <w:rPr>
+          <w:sz w:val="30"/>
+          <w:szCs w:val="30"/>
+        </w:rPr>
+        <w:t>Go to PythonAnywhere</w:t>
+      </w:r>
+      <w:r>
+        <w:rPr>
+          <w:sz w:val="30"/>
+          <w:szCs w:val="30"/>
+        </w:rPr>
+        <w:br/>
+      </w:r>
+      <w:r>
+        <w:rPr>
+          <w:sz w:val="30"/>
+          <w:szCs w:val="30"/>
+        </w:rPr>
+        <w:tab/>
+      </w:r>
+      <w:r>
+        <w:rPr>
+          <w:sz w:val="30"/>
+          <w:szCs w:val="30"/>
+        </w:rPr>
+        <w:t>bash update.sh</w:t>
+      </w:r>
+    </w:p>
+    <w:p>
+      <w:pPr>
+        <w:rPr>
+          <w:sz w:val="30"/>
+          <w:szCs w:val="30"/>
+        </w:rPr>
+      </w:pPr>
     </w:p>
     <w:p>
       <w:pPr>
@@ -164,7 +245,23 @@
           <w:sz w:val="30"/>
           <w:szCs w:val="30"/>
         </w:rPr>
-        <w:t xml:space="preserve">git add edgeboard.db -f </w:t>
+        <w:t xml:space="preserve">git add </w:t>
+      </w:r>
+      <w:proofErr w:type="spellStart"/>
+      <w:r>
+        <w:rPr>
+          <w:sz w:val="30"/>
+          <w:szCs w:val="30"/>
+        </w:rPr>
+        <w:t>edgeboard.db</w:t>
+      </w:r>
+      <w:proofErr w:type="spellEnd"/>
+      <w:r>
+        <w:rPr>
+          <w:sz w:val="30"/>
+          <w:szCs w:val="30"/>
+        </w:rPr>
+        <w:t xml:space="preserve"> </w:t>
       </w:r>
     </w:p>
     <w:p>
@@ -181,7 +278,7 @@
           <w:sz w:val="30"/>
           <w:szCs w:val="30"/>
         </w:rPr>
-        <w:t xml:space="preserve">git commit -m "Daily DB update with fresh Monte Carlo math" </w:t>
+        <w:t xml:space="preserve">git commit -m "Full master sync complete" </w:t>
       </w:r>
     </w:p>
     <w:p>
@@ -242,7 +339,23 @@
           <w:sz w:val="30"/>
           <w:szCs w:val="30"/>
         </w:rPr>
-        <w:t xml:space="preserve">cd EdgeBoard </w:t>
+        <w:t xml:space="preserve">cd </w:t>
+      </w:r>
+      <w:proofErr w:type="spellStart"/>
+      <w:r>
+        <w:rPr>
+          <w:sz w:val="30"/>
+          <w:szCs w:val="30"/>
+        </w:rPr>
+        <w:t>EdgeBoard</w:t>
+      </w:r>
+      <w:proofErr w:type="spellEnd"/>
+      <w:r>
+        <w:rPr>
+          <w:sz w:val="30"/>
+          <w:szCs w:val="30"/>
+        </w:rPr>
+        <w:t xml:space="preserve"> </w:t>
       </w:r>
     </w:p>
     <w:p>
@@ -387,6 +500,7 @@
           <w:sz w:val="30"/>
           <w:szCs w:val="30"/>
         </w:rPr>
+        <w:lastRenderedPageBreak/>
         <w:t>Pull in new updates</w:t>
       </w:r>
     </w:p>
@@ -622,6 +736,155 @@
     </w:lvl>
   </w:abstractNum>
   <w:abstractNum w:abstractNumId="2" w15:restartNumberingAfterBreak="0">
+    <w:nsid w:val="23005E7D"/>
+    <w:multiLevelType w:val="multilevel"/>
+    <w:tmpl w:val="7890B2C2"/>
+    <w:lvl w:ilvl="0">
+      <w:start w:val="1"/>
+      <w:numFmt w:val="bullet"/>
+      <w:lvlText w:val=""/>
+      <w:lvlJc w:val="left"/>
+      <w:pPr>
+        <w:tabs>
+          <w:tab w:val="num" w:pos="720"/>
+        </w:tabs>
+        <w:ind w:left="720" w:hanging="360"/>
+      </w:pPr>
+      <w:rPr>
+        <w:rFonts w:ascii="Symbol" w:hAnsi="Symbol" w:hint="default"/>
+        <w:sz w:val="20"/>
+      </w:rPr>
+    </w:lvl>
+    <w:lvl w:ilvl="1" w:tentative="1">
+      <w:start w:val="1"/>
+      <w:numFmt w:val="bullet"/>
+      <w:lvlText w:val="o"/>
+      <w:lvlJc w:val="left"/>
+      <w:pPr>
+        <w:tabs>
+          <w:tab w:val="num" w:pos="1440"/>
+        </w:tabs>
+        <w:ind w:left="1440" w:hanging="360"/>
+      </w:pPr>
+      <w:rPr>
+        <w:rFonts w:ascii="Courier New" w:hAnsi="Courier New" w:hint="default"/>
+        <w:sz w:val="20"/>
+      </w:rPr>
+    </w:lvl>
+    <w:lvl w:ilvl="2" w:tentative="1">
+      <w:start w:val="1"/>
+      <w:numFmt w:val="bullet"/>
+      <w:lvlText w:val=""/>
+      <w:lvlJc w:val="left"/>
+      <w:pPr>
+        <w:tabs>
+          <w:tab w:val="num" w:pos="2160"/>
+        </w:tabs>
+        <w:ind w:left="2160" w:hanging="360"/>
+      </w:pPr>
+      <w:rPr>
+        <w:rFonts w:ascii="Wingdings" w:hAnsi="Wingdings" w:hint="default"/>
+        <w:sz w:val="20"/>
+      </w:rPr>
+    </w:lvl>
+    <w:lvl w:ilvl="3" w:tentative="1">
+      <w:start w:val="1"/>
+      <w:numFmt w:val="bullet"/>
+      <w:lvlText w:val=""/>
+      <w:lvlJc w:val="left"/>
+      <w:pPr>
+        <w:tabs>
+          <w:tab w:val="num" w:pos="2880"/>
+        </w:tabs>
+        <w:ind w:left="2880" w:hanging="360"/>
+      </w:pPr>
+      <w:rPr>
+        <w:rFonts w:ascii="Wingdings" w:hAnsi="Wingdings" w:hint="default"/>
+        <w:sz w:val="20"/>
+      </w:rPr>
+    </w:lvl>
+    <w:lvl w:ilvl="4" w:tentative="1">
+      <w:start w:val="1"/>
+      <w:numFmt w:val="bullet"/>
+      <w:lvlText w:val=""/>
+      <w:lvlJc w:val="left"/>
+      <w:pPr>
+        <w:tabs>
+          <w:tab w:val="num" w:pos="3600"/>
+        </w:tabs>
+        <w:ind w:left="3600" w:hanging="360"/>
+      </w:pPr>
+      <w:rPr>
+        <w:rFonts w:ascii="Wingdings" w:hAnsi="Wingdings" w:hint="default"/>
+        <w:sz w:val="20"/>
+      </w:rPr>
+    </w:lvl>
+    <w:lvl w:ilvl="5" w:tentative="1">
+      <w:start w:val="1"/>
+      <w:numFmt w:val="bullet"/>
+      <w:lvlText w:val=""/>
+      <w:lvlJc w:val="left"/>
+      <w:pPr>
+        <w:tabs>
+          <w:tab w:val="num" w:pos="4320"/>
+        </w:tabs>
+        <w:ind w:left="4320" w:hanging="360"/>
+      </w:pPr>
+      <w:rPr>
+        <w:rFonts w:ascii="Wingdings" w:hAnsi="Wingdings" w:hint="default"/>
+        <w:sz w:val="20"/>
+      </w:rPr>
+    </w:lvl>
+    <w:lvl w:ilvl="6" w:tentative="1">
+      <w:start w:val="1"/>
+      <w:numFmt w:val="bullet"/>
+      <w:lvlText w:val=""/>
+      <w:lvlJc w:val="left"/>
+      <w:pPr>
+        <w:tabs>
+          <w:tab w:val="num" w:pos="5040"/>
+        </w:tabs>
+        <w:ind w:left="5040" w:hanging="360"/>
+      </w:pPr>
+      <w:rPr>
+        <w:rFonts w:ascii="Wingdings" w:hAnsi="Wingdings" w:hint="default"/>
+        <w:sz w:val="20"/>
+      </w:rPr>
+    </w:lvl>
+    <w:lvl w:ilvl="7" w:tentative="1">
+      <w:start w:val="1"/>
+      <w:numFmt w:val="bullet"/>
+      <w:lvlText w:val=""/>
+      <w:lvlJc w:val="left"/>
+      <w:pPr>
+        <w:tabs>
+          <w:tab w:val="num" w:pos="5760"/>
+        </w:tabs>
+        <w:ind w:left="5760" w:hanging="360"/>
+      </w:pPr>
+      <w:rPr>
+        <w:rFonts w:ascii="Wingdings" w:hAnsi="Wingdings" w:hint="default"/>
+        <w:sz w:val="20"/>
+      </w:rPr>
+    </w:lvl>
+    <w:lvl w:ilvl="8" w:tentative="1">
+      <w:start w:val="1"/>
+      <w:numFmt w:val="bullet"/>
+      <w:lvlText w:val=""/>
+      <w:lvlJc w:val="left"/>
+      <w:pPr>
+        <w:tabs>
+          <w:tab w:val="num" w:pos="6480"/>
+        </w:tabs>
+        <w:ind w:left="6480" w:hanging="360"/>
+      </w:pPr>
+      <w:rPr>
+        <w:rFonts w:ascii="Wingdings" w:hAnsi="Wingdings" w:hint="default"/>
+        <w:sz w:val="20"/>
+      </w:rPr>
+    </w:lvl>
+  </w:abstractNum>
+  <w:abstractNum w:abstractNumId="3" w15:restartNumberingAfterBreak="0">
     <w:nsid w:val="49EC193E"/>
     <w:multiLevelType w:val="hybridMultilevel"/>
     <w:tmpl w:val="1F3A3EE6"/>
@@ -734,14 +997,169 @@
       </w:rPr>
     </w:lvl>
   </w:abstractNum>
+  <w:abstractNum w:abstractNumId="4" w15:restartNumberingAfterBreak="0">
+    <w:nsid w:val="511975CA"/>
+    <w:multiLevelType w:val="multilevel"/>
+    <w:tmpl w:val="4EC07C46"/>
+    <w:lvl w:ilvl="0">
+      <w:start w:val="1"/>
+      <w:numFmt w:val="bullet"/>
+      <w:lvlText w:val=""/>
+      <w:lvlJc w:val="left"/>
+      <w:pPr>
+        <w:tabs>
+          <w:tab w:val="num" w:pos="720"/>
+        </w:tabs>
+        <w:ind w:left="720" w:hanging="360"/>
+      </w:pPr>
+      <w:rPr>
+        <w:rFonts w:ascii="Symbol" w:hAnsi="Symbol" w:hint="default"/>
+        <w:sz w:val="20"/>
+      </w:rPr>
+    </w:lvl>
+    <w:lvl w:ilvl="1" w:tentative="1">
+      <w:start w:val="1"/>
+      <w:numFmt w:val="bullet"/>
+      <w:lvlText w:val="o"/>
+      <w:lvlJc w:val="left"/>
+      <w:pPr>
+        <w:tabs>
+          <w:tab w:val="num" w:pos="1440"/>
+        </w:tabs>
+        <w:ind w:left="1440" w:hanging="360"/>
+      </w:pPr>
+      <w:rPr>
+        <w:rFonts w:ascii="Courier New" w:hAnsi="Courier New" w:hint="default"/>
+        <w:sz w:val="20"/>
+      </w:rPr>
+    </w:lvl>
+    <w:lvl w:ilvl="2" w:tentative="1">
+      <w:start w:val="1"/>
+      <w:numFmt w:val="bullet"/>
+      <w:lvlText w:val=""/>
+      <w:lvlJc w:val="left"/>
+      <w:pPr>
+        <w:tabs>
+          <w:tab w:val="num" w:pos="2160"/>
+        </w:tabs>
+        <w:ind w:left="2160" w:hanging="360"/>
+      </w:pPr>
+      <w:rPr>
+        <w:rFonts w:ascii="Wingdings" w:hAnsi="Wingdings" w:hint="default"/>
+        <w:sz w:val="20"/>
+      </w:rPr>
+    </w:lvl>
+    <w:lvl w:ilvl="3" w:tentative="1">
+      <w:start w:val="1"/>
+      <w:numFmt w:val="bullet"/>
+      <w:lvlText w:val=""/>
+      <w:lvlJc w:val="left"/>
+      <w:pPr>
+        <w:tabs>
+          <w:tab w:val="num" w:pos="2880"/>
+        </w:tabs>
+        <w:ind w:left="2880" w:hanging="360"/>
+      </w:pPr>
+      <w:rPr>
+        <w:rFonts w:ascii="Wingdings" w:hAnsi="Wingdings" w:hint="default"/>
+        <w:sz w:val="20"/>
+      </w:rPr>
+    </w:lvl>
+    <w:lvl w:ilvl="4" w:tentative="1">
+      <w:start w:val="1"/>
+      <w:numFmt w:val="bullet"/>
+      <w:lvlText w:val=""/>
+      <w:lvlJc w:val="left"/>
+      <w:pPr>
+        <w:tabs>
+          <w:tab w:val="num" w:pos="3600"/>
+        </w:tabs>
+        <w:ind w:left="3600" w:hanging="360"/>
+      </w:pPr>
+      <w:rPr>
+        <w:rFonts w:ascii="Wingdings" w:hAnsi="Wingdings" w:hint="default"/>
+        <w:sz w:val="20"/>
+      </w:rPr>
+    </w:lvl>
+    <w:lvl w:ilvl="5" w:tentative="1">
+      <w:start w:val="1"/>
+      <w:numFmt w:val="bullet"/>
+      <w:lvlText w:val=""/>
+      <w:lvlJc w:val="left"/>
+      <w:pPr>
+        <w:tabs>
+          <w:tab w:val="num" w:pos="4320"/>
+        </w:tabs>
+        <w:ind w:left="4320" w:hanging="360"/>
+      </w:pPr>
+      <w:rPr>
+        <w:rFonts w:ascii="Wingdings" w:hAnsi="Wingdings" w:hint="default"/>
+        <w:sz w:val="20"/>
+      </w:rPr>
+    </w:lvl>
+    <w:lvl w:ilvl="6" w:tentative="1">
+      <w:start w:val="1"/>
+      <w:numFmt w:val="bullet"/>
+      <w:lvlText w:val=""/>
+      <w:lvlJc w:val="left"/>
+      <w:pPr>
+        <w:tabs>
+          <w:tab w:val="num" w:pos="5040"/>
+        </w:tabs>
+        <w:ind w:left="5040" w:hanging="360"/>
+      </w:pPr>
+      <w:rPr>
+        <w:rFonts w:ascii="Wingdings" w:hAnsi="Wingdings" w:hint="default"/>
+        <w:sz w:val="20"/>
+      </w:rPr>
+    </w:lvl>
+    <w:lvl w:ilvl="7" w:tentative="1">
+      <w:start w:val="1"/>
+      <w:numFmt w:val="bullet"/>
+      <w:lvlText w:val=""/>
+      <w:lvlJc w:val="left"/>
+      <w:pPr>
+        <w:tabs>
+          <w:tab w:val="num" w:pos="5760"/>
+        </w:tabs>
+        <w:ind w:left="5760" w:hanging="360"/>
+      </w:pPr>
+      <w:rPr>
+        <w:rFonts w:ascii="Wingdings" w:hAnsi="Wingdings" w:hint="default"/>
+        <w:sz w:val="20"/>
+      </w:rPr>
+    </w:lvl>
+    <w:lvl w:ilvl="8" w:tentative="1">
+      <w:start w:val="1"/>
+      <w:numFmt w:val="bullet"/>
+      <w:lvlText w:val=""/>
+      <w:lvlJc w:val="left"/>
+      <w:pPr>
+        <w:tabs>
+          <w:tab w:val="num" w:pos="6480"/>
+        </w:tabs>
+        <w:ind w:left="6480" w:hanging="360"/>
+      </w:pPr>
+      <w:rPr>
+        <w:rFonts w:ascii="Wingdings" w:hAnsi="Wingdings" w:hint="default"/>
+        <w:sz w:val="20"/>
+      </w:rPr>
+    </w:lvl>
+  </w:abstractNum>
   <w:num w:numId="1" w16cid:durableId="803885903">
-    <w:abstractNumId w:val="2"/>
+    <w:abstractNumId w:val="3"/>
   </w:num>
   <w:num w:numId="2" w16cid:durableId="993725894">
     <w:abstractNumId w:val="0"/>
   </w:num>
   <w:num w:numId="3" w16cid:durableId="1222983237">
     <w:abstractNumId w:val="1"/>
+  </w:num>
+  <w:num w:numId="4" w16cid:durableId="848830556">
+    <w:abstractNumId w:val="2"/>
+  </w:num>
+  <w:num w:numId="5" w16cid:durableId="239601978">
+    <w:abstractNumId w:val="4"/>
   </w:num>
 </w:numbering>
 </file>
@@ -1349,7 +1767,6 @@
   <w:style w:type="character" w:default="1" w:styleId="DefaultParagraphFont">
     <w:name w:val="Default Paragraph Font"/>
     <w:uiPriority w:val="1"/>
-    <w:semiHidden/>
     <w:unhideWhenUsed/>
   </w:style>
   <w:style w:type="table" w:default="1" w:styleId="TableNormal">

</xml_diff>